<commit_message>
User guide: screenshots and wording for the redesigned web app
</commit_message>
<xml_diff>
--- a/docs/CPS_Testbed_User_Guide.docx
+++ b/docs/CPS_Testbed_User_Guide.docx
@@ -496,7 +496,7 @@
           <w:sz w:val="20"/>
           <w:szCs w:val="20"/>
         </w:rPr>
-        <w:t xml:space="preserve">	13</w:t>
+        <w:t xml:space="preserve">	14</w:t>
       </w:r>
     </w:p>
     <w:p>
@@ -521,7 +521,7 @@
           <w:sz w:val="20"/>
           <w:szCs w:val="20"/>
         </w:rPr>
-        <w:t xml:space="preserve">	14</w:t>
+        <w:t xml:space="preserve">	15</w:t>
       </w:r>
     </w:p>
     <w:p>
@@ -546,7 +546,7 @@
           <w:sz w:val="20"/>
           <w:szCs w:val="20"/>
         </w:rPr>
-        <w:t xml:space="preserve">	14</w:t>
+        <w:t xml:space="preserve">	15</w:t>
       </w:r>
     </w:p>
     <w:p>
@@ -571,7 +571,7 @@
           <w:sz w:val="22"/>
           <w:szCs w:val="22"/>
         </w:rPr>
-        <w:t xml:space="preserve">	15</w:t>
+        <w:t xml:space="preserve">	16</w:t>
       </w:r>
     </w:p>
     <w:p>
@@ -596,7 +596,7 @@
           <w:sz w:val="20"/>
           <w:szCs w:val="20"/>
         </w:rPr>
-        <w:t xml:space="preserve">	15</w:t>
+        <w:t xml:space="preserve">	16</w:t>
       </w:r>
     </w:p>
     <w:p>
@@ -621,7 +621,7 @@
           <w:sz w:val="20"/>
           <w:szCs w:val="20"/>
         </w:rPr>
-        <w:t xml:space="preserve">	16</w:t>
+        <w:t xml:space="preserve">	18</w:t>
       </w:r>
     </w:p>
     <w:p>
@@ -646,7 +646,7 @@
           <w:sz w:val="20"/>
           <w:szCs w:val="20"/>
         </w:rPr>
-        <w:t xml:space="preserve">	16</w:t>
+        <w:t xml:space="preserve">	18</w:t>
       </w:r>
     </w:p>
     <w:p>
@@ -671,7 +671,7 @@
           <w:sz w:val="20"/>
           <w:szCs w:val="20"/>
         </w:rPr>
-        <w:t xml:space="preserve">	17</w:t>
+        <w:t xml:space="preserve">	18</w:t>
       </w:r>
     </w:p>
     <w:p>
@@ -696,7 +696,7 @@
           <w:sz w:val="20"/>
           <w:szCs w:val="20"/>
         </w:rPr>
-        <w:t xml:space="preserve">	17</w:t>
+        <w:t xml:space="preserve">	18</w:t>
       </w:r>
     </w:p>
     <w:p>
@@ -721,7 +721,7 @@
           <w:sz w:val="22"/>
           <w:szCs w:val="22"/>
         </w:rPr>
-        <w:t xml:space="preserve">	18</w:t>
+        <w:t xml:space="preserve">	19</w:t>
       </w:r>
     </w:p>
     <w:p>
@@ -746,7 +746,7 @@
           <w:sz w:val="20"/>
           <w:szCs w:val="20"/>
         </w:rPr>
-        <w:t xml:space="preserve">	18</w:t>
+        <w:t xml:space="preserve">	19</w:t>
       </w:r>
     </w:p>
     <w:p>
@@ -771,7 +771,7 @@
           <w:sz w:val="20"/>
           <w:szCs w:val="20"/>
         </w:rPr>
-        <w:t xml:space="preserve">	19</w:t>
+        <w:t xml:space="preserve">	20</w:t>
       </w:r>
     </w:p>
     <w:p>
@@ -796,7 +796,7 @@
           <w:sz w:val="22"/>
           <w:szCs w:val="22"/>
         </w:rPr>
-        <w:t xml:space="preserve">	20</w:t>
+        <w:t xml:space="preserve">	21</w:t>
       </w:r>
     </w:p>
     <w:p>
@@ -3044,47 +3044,67 @@
         <w:spacing w:after="120" w:line="276"/>
       </w:pPr>
       <w:r>
-        <w:t xml:space="preserve">The page has three areas (Fig. 1): the </w:t>
+        <w:t xml:space="preserve">The header shows the project, the Principal Investigator and the grant, and a status light on the right: green </w:t>
       </w:r>
       <w:r>
         <w:rPr>
           <w:b/>
           <w:bCs/>
         </w:rPr>
-        <w:t xml:space="preserve">New experiment</w:t>
-      </w:r>
-      <w:r>
-        <w:t xml:space="preserve"> form on the left, the </w:t>
+        <w:t xml:space="preserve">Idle · ready</w:t>
+      </w:r>
+      <w:r>
+        <w:t xml:space="preserve">, or amber </w:t>
       </w:r>
       <w:r>
         <w:rPr>
           <w:b/>
           <w:bCs/>
         </w:rPr>
-        <w:t xml:space="preserve">Queue</w:t>
-      </w:r>
-      <w:r>
-        <w:t xml:space="preserve"> and </w:t>
+        <w:t xml:space="preserve">Running</w:t>
+      </w:r>
+      <w:r>
+        <w:t xml:space="preserve"> while experiments are in the queue. Below it the page has three areas (Fig. 1): the </w:t>
       </w:r>
       <w:r>
         <w:rPr>
           <w:b/>
           <w:bCs/>
         </w:rPr>
-        <w:t xml:space="preserve">Runs</w:t>
-      </w:r>
-      <w:r>
-        <w:t xml:space="preserve"> list at the top right, and the </w:t>
+        <w:t xml:space="preserve">New experiment</w:t>
+      </w:r>
+      <w:r>
+        <w:t xml:space="preserve"> form on the left, the </w:t>
       </w:r>
       <w:r>
         <w:rPr>
           <w:b/>
           <w:bCs/>
         </w:rPr>
+        <w:t xml:space="preserve">Queue</w:t>
+      </w:r>
+      <w:r>
+        <w:t xml:space="preserve"> and </w:t>
+      </w:r>
+      <w:r>
+        <w:rPr>
+          <w:b/>
+          <w:bCs/>
+        </w:rPr>
+        <w:t xml:space="preserve">Runs</w:t>
+      </w:r>
+      <w:r>
+        <w:t xml:space="preserve"> list at the top right, and the </w:t>
+      </w:r>
+      <w:r>
+        <w:rPr>
+          <w:b/>
+          <w:bCs/>
+        </w:rPr>
         <w:t xml:space="preserve">results</w:t>
       </w:r>
       <w:r>
-        <w:t xml:space="preserve"> of the selected run below them.</w:t>
+        <w:t xml:space="preserve"> of the selected run below them. The footer lists the research team and links to the GitHub repository, this guide and the technical report.</w:t>
       </w:r>
     </w:p>
     <w:p>
@@ -3172,7 +3192,7 @@
         <w:spacing w:after="120" w:line="276"/>
       </w:pPr>
       <w:r>
-        <w:t xml:space="preserve">The preset buttons fill in the form for common scenarios. They use the bus system currently selected, so choose the </w:t>
+        <w:t xml:space="preserve">The preset cards at the top of the form fill it in for common scenarios. They use the bus system currently selected, so choose the </w:t>
       </w:r>
       <w:r>
         <w:rPr>
@@ -3663,7 +3683,7 @@
       <w:r>
         <w:drawing>
           <wp:inline distT="0" distB="0" distL="0" distR="0">
-            <wp:extent cx="1962150" cy="6991350"/>
+            <wp:extent cx="1781175" cy="7458075"/>
             <wp:effectExtent t="0" r="0" b="0" l="0"/>
             <wp:docPr id="2" name="form_300.png" descr="Figure 2: The form after choosing IEEE 300-bus and the “Fault + stealthy FDI” preset." title="Figure 2: The form after choosing IEEE 300-bus and the “Fault + stealthy FDI” preset."/>
             <wp:cNvGraphicFramePr>
@@ -3688,7 +3708,7 @@
                   <pic:spPr bwMode="auto">
                     <a:xfrm>
                       <a:off x="0" y="0"/>
-                      <a:ext cx="1962150" cy="6991350"/>
+                      <a:ext cx="1781175" cy="7458075"/>
                     </a:xfrm>
                     <a:prstGeom prst="rect">
                       <a:avLst/>
@@ -4669,7 +4689,7 @@
                 <w:sz w:val="19"/>
                 <w:szCs w:val="19"/>
               </w:rPr>
-              <w:t xml:space="preserve">Faulty setpoint (pu) / Load change (%)</w:t>
+              <w:t xml:space="preserve">Setpoint (pu) / Change (%)</w:t>
             </w:r>
           </w:p>
         </w:tc>
@@ -4698,7 +4718,7 @@
                 <w:sz w:val="19"/>
                 <w:szCs w:val="19"/>
               </w:rPr>
-              <w:t xml:space="preserve">The new generator setpoint, or the load change in percent (negative to reduce).</w:t>
+              <w:t xml:space="preserve">The faulty generator setpoint, or the load change in percent (negative to reduce).</w:t>
             </w:r>
           </w:p>
         </w:tc>
@@ -7607,9 +7627,9 @@
       <w:r>
         <w:drawing>
           <wp:inline distT="0" distB="0" distL="0" distR="0">
-            <wp:extent cx="5943600" cy="638175"/>
+            <wp:extent cx="5943600" cy="657225"/>
             <wp:effectExtent t="0" r="0" b="0" l="0"/>
-            <wp:docPr id="3" name="queue.png" descr="Figure 3: The queue with two finished jobs." title="Figure 3: The queue with two finished jobs."/>
+            <wp:docPr id="3" name="queue.png" descr="Figure 3: The queue panel when no experiment is waiting or running; the count at the top right shows active jobs." title="Figure 3: The queue panel when no experiment is waiting or running; the count at the top right shows active jobs."/>
             <wp:cNvGraphicFramePr>
               <a:graphicFrameLocks xmlns:a="http://schemas.openxmlformats.org/drawingml/2006/main" noChangeAspect="1"/>
             </wp:cNvGraphicFramePr>
@@ -7632,7 +7652,7 @@
                   <pic:spPr bwMode="auto">
                     <a:xfrm>
                       <a:off x="0" y="0"/>
-                      <a:ext cx="5943600" cy="638175"/>
+                      <a:ext cx="5943600" cy="657225"/>
                     </a:xfrm>
                     <a:prstGeom prst="rect">
                       <a:avLst/>
@@ -7658,7 +7678,7 @@
           <w:sz w:val="18"/>
           <w:szCs w:val="18"/>
         </w:rPr>
-        <w:t xml:space="preserve">Figure 3: The queue with two finished jobs.</w:t>
+        <w:t xml:space="preserve">Figure 3: The queue panel when no experiment is waiting or running; the count at the top right shows active jobs.</w:t>
       </w:r>
     </w:p>
     <w:p>
@@ -8217,7 +8237,37 @@
         <w:spacing w:after="120" w:line="276"/>
       </w:pPr>
       <w:r>
-        <w:t xml:space="preserve">The line under the run title repeats the main settings. The boxes below it summarise the run (Fig. 4).</w:t>
+        <w:t xml:space="preserve">The tags under the run title repeat the main settings. The boxes below them summarise the run (Fig. 4). Their colour is a quick verdict: </w:t>
+      </w:r>
+      <w:r>
+        <w:rPr>
+          <w:b/>
+          <w:bCs/>
+        </w:rPr>
+        <w:t xml:space="preserve">green</w:t>
+      </w:r>
+      <w:r>
+        <w:t xml:space="preserve"> for a good outcome (for example a violation corrected within a second, or an attack detected), </w:t>
+      </w:r>
+      <w:r>
+        <w:rPr>
+          <w:b/>
+          <w:bCs/>
+        </w:rPr>
+        <w:t xml:space="preserve">amber</w:t>
+      </w:r>
+      <w:r>
+        <w:t xml:space="preserve"> for borderline and </w:t>
+      </w:r>
+      <w:r>
+        <w:rPr>
+          <w:b/>
+          <w:bCs/>
+        </w:rPr>
+        <w:t xml:space="preserve">red</w:t>
+      </w:r>
+      <w:r>
+        <w:t xml:space="preserve"> for a problem (for example a long violation, an undetected attack or incomplete data); grey boxes are information only.</w:t>
       </w:r>
     </w:p>
     <w:p>
@@ -8229,7 +8279,7 @@
       <w:r>
         <w:drawing>
           <wp:inline distT="0" distB="0" distL="0" distR="0">
-            <wp:extent cx="5943600" cy="1000125"/>
+            <wp:extent cx="5943600" cy="1647825"/>
             <wp:effectExtent t="0" r="0" b="0" l="0"/>
             <wp:docPr id="4" name="kpis.png" descr="Figure 4: Summary figures of a run with a generator fault and a simple FDI attack on IEEE 118." title="Figure 4: Summary figures of a run with a generator fault and a simple FDI attack on IEEE 118."/>
             <wp:cNvGraphicFramePr>
@@ -8254,7 +8304,7 @@
                   <pic:spPr bwMode="auto">
                     <a:xfrm>
                       <a:off x="0" y="0"/>
-                      <a:ext cx="5943600" cy="1000125"/>
+                      <a:ext cx="5943600" cy="1647825"/>
                     </a:xfrm>
                     <a:prstGeom prst="rect">
                       <a:avLst/>
@@ -9079,7 +9129,7 @@
       <w:r>
         <w:drawing>
           <wp:inline distT="0" distB="0" distL="0" distR="0">
-            <wp:extent cx="5762625" cy="4972050"/>
+            <wp:extent cx="5762625" cy="5981700"/>
             <wp:effectExtent t="0" r="0" b="0" l="0"/>
             <wp:docPr id="5" name="charts.png" descr="Figure 5: The six result charts. The shaded band marks the attack window." title="Figure 5: The six result charts. The shaded band marks the attack window."/>
             <wp:cNvGraphicFramePr>
@@ -9104,7 +9154,7 @@
                   <pic:spPr bwMode="auto">
                     <a:xfrm>
                       <a:off x="0" y="0"/>
-                      <a:ext cx="5762625" cy="4972050"/>
+                      <a:ext cx="5762625" cy="5981700"/>
                     </a:xfrm>
                     <a:prstGeom prst="rect">
                       <a:avLst/>
@@ -9283,14 +9333,14 @@
                 <w:sz w:val="19"/>
                 <w:szCs w:val="19"/>
               </w:rPr>
-              <w:t xml:space="preserve">Bus</w:t>
-            </w:r>
-            <w:r>
-              <w:rPr>
-                <w:sz w:val="19"/>
-                <w:szCs w:val="19"/>
-              </w:rPr>
-              <w:t xml:space="preserve"> box at the top right and </w:t>
+              <w:t xml:space="preserve">Plot bus</w:t>
+            </w:r>
+            <w:r>
+              <w:rPr>
+                <w:sz w:val="19"/>
+                <w:szCs w:val="19"/>
+              </w:rPr>
+              <w:t xml:space="preserve"> box and </w:t>
             </w:r>
             <w:r>
               <w:rPr>
@@ -9304,7 +9354,7 @@
                 <w:sz w:val="19"/>
                 <w:szCs w:val="19"/>
               </w:rPr>
-              <w:t xml:space="preserve">.</w:t>
+              <w:t xml:space="preserve"> (or press Enter).</w:t>
             </w:r>
           </w:p>
         </w:tc>
@@ -10480,7 +10530,7 @@
       <w:r>
         <w:drawing>
           <wp:inline distT="0" distB="0" distL="0" distR="0">
-            <wp:extent cx="4933950" cy="6210300"/>
+            <wp:extent cx="4572000" cy="7534275"/>
             <wp:effectExtent t="0" r="0" b="0" l="0"/>
             <wp:docPr id="6" name="detail.png" descr="Figure 6: Results of the IEEE 118-bus generator fault with a simple FDI attack on bus 49." title="Figure 6: Results of the IEEE 118-bus generator fault with a simple FDI attack on bus 49."/>
             <wp:cNvGraphicFramePr>
@@ -10505,7 +10555,7 @@
                   <pic:spPr bwMode="auto">
                     <a:xfrm>
                       <a:off x="0" y="0"/>
-                      <a:ext cx="4933950" cy="6210300"/>
+                      <a:ext cx="4572000" cy="7534275"/>
                     </a:xfrm>
                     <a:prstGeom prst="rect">
                       <a:avLst/>
@@ -10564,7 +10614,7 @@
           <w:b/>
           <w:bCs/>
         </w:rPr>
-        <w:t xml:space="preserve">Bus</w:t>
+        <w:t xml:space="preserve">Plot bus</w:t>
       </w:r>
       <w:r>
         <w:t xml:space="preserve"> box to see this.</w:t>
@@ -10684,7 +10734,7 @@
           <w:b/>
           <w:bCs/>
         </w:rPr>
-        <w:t xml:space="preserve">Bus</w:t>
+        <w:t xml:space="preserve">Plot bus</w:t>
       </w:r>
       <w:r>
         <w:t xml:space="preserve"> box to plot any of the 300 buses.</w:t>

</xml_diff>